<commit_message>
update tuan 4 phan 1
</commit_message>
<xml_diff>
--- a/Tuan4/Phần 1.docx
+++ b/Tuan4/Phần 1.docx
@@ -977,6 +977,9 @@
     </w:p>
     <w:p>
       <w:r>
+        <w:rPr>
+          <w:noProof/>
+        </w:rPr>
         <w:lastRenderedPageBreak/>
         <w:drawing>
           <wp:inline distT="0" distB="0" distL="0" distR="0" wp14:anchorId="21BC23FC" wp14:editId="5C9909B3">
@@ -1030,6 +1033,45 @@
     </w:p>
     <w:p>
       <w:r>
+        <w:drawing>
+          <wp:inline distT="0" distB="0" distL="0" distR="0" wp14:anchorId="5FA9550B" wp14:editId="0F7D1942">
+            <wp:extent cx="5943600" cy="967740"/>
+            <wp:effectExtent l="0" t="0" r="0" b="3810"/>
+            <wp:docPr id="19" name="Picture 19"/>
+            <wp:cNvGraphicFramePr>
+              <a:graphicFrameLocks xmlns:a="http://schemas.openxmlformats.org/drawingml/2006/main" noChangeAspect="1"/>
+            </wp:cNvGraphicFramePr>
+            <a:graphic xmlns:a="http://schemas.openxmlformats.org/drawingml/2006/main">
+              <a:graphicData uri="http://schemas.openxmlformats.org/drawingml/2006/picture">
+                <pic:pic xmlns:pic="http://schemas.openxmlformats.org/drawingml/2006/picture">
+                  <pic:nvPicPr>
+                    <pic:cNvPr id="1" name=""/>
+                    <pic:cNvPicPr/>
+                  </pic:nvPicPr>
+                  <pic:blipFill>
+                    <a:blip r:embed="rId23"/>
+                    <a:stretch>
+                      <a:fillRect/>
+                    </a:stretch>
+                  </pic:blipFill>
+                  <pic:spPr>
+                    <a:xfrm>
+                      <a:off x="0" y="0"/>
+                      <a:ext cx="5943600" cy="967740"/>
+                    </a:xfrm>
+                    <a:prstGeom prst="rect">
+                      <a:avLst/>
+                    </a:prstGeom>
+                  </pic:spPr>
+                </pic:pic>
+              </a:graphicData>
+            </a:graphic>
+          </wp:inline>
+        </w:drawing>
+      </w:r>
+    </w:p>
+    <w:p>
+      <w:r>
         <w:tab/>
         <w:t>19</w:t>
       </w:r>
@@ -1043,6 +1085,45 @@
     </w:p>
     <w:p>
       <w:r>
+        <w:drawing>
+          <wp:inline distT="0" distB="0" distL="0" distR="0" wp14:anchorId="2CCBA695" wp14:editId="6935F462">
+            <wp:extent cx="5943600" cy="1264285"/>
+            <wp:effectExtent l="0" t="0" r="0" b="0"/>
+            <wp:docPr id="20" name="Picture 20"/>
+            <wp:cNvGraphicFramePr>
+              <a:graphicFrameLocks xmlns:a="http://schemas.openxmlformats.org/drawingml/2006/main" noChangeAspect="1"/>
+            </wp:cNvGraphicFramePr>
+            <a:graphic xmlns:a="http://schemas.openxmlformats.org/drawingml/2006/main">
+              <a:graphicData uri="http://schemas.openxmlformats.org/drawingml/2006/picture">
+                <pic:pic xmlns:pic="http://schemas.openxmlformats.org/drawingml/2006/picture">
+                  <pic:nvPicPr>
+                    <pic:cNvPr id="1" name=""/>
+                    <pic:cNvPicPr/>
+                  </pic:nvPicPr>
+                  <pic:blipFill>
+                    <a:blip r:embed="rId24"/>
+                    <a:stretch>
+                      <a:fillRect/>
+                    </a:stretch>
+                  </pic:blipFill>
+                  <pic:spPr>
+                    <a:xfrm>
+                      <a:off x="0" y="0"/>
+                      <a:ext cx="5943600" cy="1264285"/>
+                    </a:xfrm>
+                    <a:prstGeom prst="rect">
+                      <a:avLst/>
+                    </a:prstGeom>
+                  </pic:spPr>
+                </pic:pic>
+              </a:graphicData>
+            </a:graphic>
+          </wp:inline>
+        </w:drawing>
+      </w:r>
+    </w:p>
+    <w:p>
+      <w:r>
         <w:tab/>
         <w:t>20</w:t>
       </w:r>
@@ -1056,6 +1137,46 @@
     </w:p>
     <w:p>
       <w:r>
+        <w:lastRenderedPageBreak/>
+        <w:drawing>
+          <wp:inline distT="0" distB="0" distL="0" distR="0" wp14:anchorId="5C845982" wp14:editId="45A28B64">
+            <wp:extent cx="5943600" cy="1944370"/>
+            <wp:effectExtent l="0" t="0" r="0" b="0"/>
+            <wp:docPr id="21" name="Picture 21"/>
+            <wp:cNvGraphicFramePr>
+              <a:graphicFrameLocks xmlns:a="http://schemas.openxmlformats.org/drawingml/2006/main" noChangeAspect="1"/>
+            </wp:cNvGraphicFramePr>
+            <a:graphic xmlns:a="http://schemas.openxmlformats.org/drawingml/2006/main">
+              <a:graphicData uri="http://schemas.openxmlformats.org/drawingml/2006/picture">
+                <pic:pic xmlns:pic="http://schemas.openxmlformats.org/drawingml/2006/picture">
+                  <pic:nvPicPr>
+                    <pic:cNvPr id="1" name=""/>
+                    <pic:cNvPicPr/>
+                  </pic:nvPicPr>
+                  <pic:blipFill>
+                    <a:blip r:embed="rId25"/>
+                    <a:stretch>
+                      <a:fillRect/>
+                    </a:stretch>
+                  </pic:blipFill>
+                  <pic:spPr>
+                    <a:xfrm>
+                      <a:off x="0" y="0"/>
+                      <a:ext cx="5943600" cy="1944370"/>
+                    </a:xfrm>
+                    <a:prstGeom prst="rect">
+                      <a:avLst/>
+                    </a:prstGeom>
+                  </pic:spPr>
+                </pic:pic>
+              </a:graphicData>
+            </a:graphic>
+          </wp:inline>
+        </w:drawing>
+      </w:r>
+    </w:p>
+    <w:p>
+      <w:r>
         <w:tab/>
         <w:t>21</w:t>
       </w:r>
@@ -1069,6 +1190,45 @@
     </w:p>
     <w:p>
       <w:r>
+        <w:drawing>
+          <wp:inline distT="0" distB="0" distL="0" distR="0" wp14:anchorId="4C1CB59F" wp14:editId="4C5EAE45">
+            <wp:extent cx="5943600" cy="568325"/>
+            <wp:effectExtent l="0" t="0" r="0" b="3175"/>
+            <wp:docPr id="22" name="Picture 22"/>
+            <wp:cNvGraphicFramePr>
+              <a:graphicFrameLocks xmlns:a="http://schemas.openxmlformats.org/drawingml/2006/main" noChangeAspect="1"/>
+            </wp:cNvGraphicFramePr>
+            <a:graphic xmlns:a="http://schemas.openxmlformats.org/drawingml/2006/main">
+              <a:graphicData uri="http://schemas.openxmlformats.org/drawingml/2006/picture">
+                <pic:pic xmlns:pic="http://schemas.openxmlformats.org/drawingml/2006/picture">
+                  <pic:nvPicPr>
+                    <pic:cNvPr id="1" name=""/>
+                    <pic:cNvPicPr/>
+                  </pic:nvPicPr>
+                  <pic:blipFill>
+                    <a:blip r:embed="rId26"/>
+                    <a:stretch>
+                      <a:fillRect/>
+                    </a:stretch>
+                  </pic:blipFill>
+                  <pic:spPr>
+                    <a:xfrm>
+                      <a:off x="0" y="0"/>
+                      <a:ext cx="5943600" cy="568325"/>
+                    </a:xfrm>
+                    <a:prstGeom prst="rect">
+                      <a:avLst/>
+                    </a:prstGeom>
+                  </pic:spPr>
+                </pic:pic>
+              </a:graphicData>
+            </a:graphic>
+          </wp:inline>
+        </w:drawing>
+      </w:r>
+    </w:p>
+    <w:p>
+      <w:r>
         <w:tab/>
         <w:t>22</w:t>
       </w:r>
@@ -1082,6 +1242,45 @@
     </w:p>
     <w:p>
       <w:r>
+        <w:drawing>
+          <wp:inline distT="0" distB="0" distL="0" distR="0" wp14:anchorId="78C926F7" wp14:editId="4E6ED36F">
+            <wp:extent cx="5943600" cy="1495425"/>
+            <wp:effectExtent l="0" t="0" r="0" b="9525"/>
+            <wp:docPr id="23" name="Picture 23"/>
+            <wp:cNvGraphicFramePr>
+              <a:graphicFrameLocks xmlns:a="http://schemas.openxmlformats.org/drawingml/2006/main" noChangeAspect="1"/>
+            </wp:cNvGraphicFramePr>
+            <a:graphic xmlns:a="http://schemas.openxmlformats.org/drawingml/2006/main">
+              <a:graphicData uri="http://schemas.openxmlformats.org/drawingml/2006/picture">
+                <pic:pic xmlns:pic="http://schemas.openxmlformats.org/drawingml/2006/picture">
+                  <pic:nvPicPr>
+                    <pic:cNvPr id="1" name=""/>
+                    <pic:cNvPicPr/>
+                  </pic:nvPicPr>
+                  <pic:blipFill>
+                    <a:blip r:embed="rId27"/>
+                    <a:stretch>
+                      <a:fillRect/>
+                    </a:stretch>
+                  </pic:blipFill>
+                  <pic:spPr>
+                    <a:xfrm>
+                      <a:off x="0" y="0"/>
+                      <a:ext cx="5943600" cy="1495425"/>
+                    </a:xfrm>
+                    <a:prstGeom prst="rect">
+                      <a:avLst/>
+                    </a:prstGeom>
+                  </pic:spPr>
+                </pic:pic>
+              </a:graphicData>
+            </a:graphic>
+          </wp:inline>
+        </w:drawing>
+      </w:r>
+    </w:p>
+    <w:p>
+      <w:r>
         <w:tab/>
         <w:t>23</w:t>
       </w:r>
@@ -1095,6 +1294,45 @@
     </w:p>
     <w:p>
       <w:r>
+        <w:drawing>
+          <wp:inline distT="0" distB="0" distL="0" distR="0" wp14:anchorId="7D7C152A" wp14:editId="40F5175F">
+            <wp:extent cx="5943600" cy="1310640"/>
+            <wp:effectExtent l="0" t="0" r="0" b="3810"/>
+            <wp:docPr id="24" name="Picture 24"/>
+            <wp:cNvGraphicFramePr>
+              <a:graphicFrameLocks xmlns:a="http://schemas.openxmlformats.org/drawingml/2006/main" noChangeAspect="1"/>
+            </wp:cNvGraphicFramePr>
+            <a:graphic xmlns:a="http://schemas.openxmlformats.org/drawingml/2006/main">
+              <a:graphicData uri="http://schemas.openxmlformats.org/drawingml/2006/picture">
+                <pic:pic xmlns:pic="http://schemas.openxmlformats.org/drawingml/2006/picture">
+                  <pic:nvPicPr>
+                    <pic:cNvPr id="1" name=""/>
+                    <pic:cNvPicPr/>
+                  </pic:nvPicPr>
+                  <pic:blipFill>
+                    <a:blip r:embed="rId28"/>
+                    <a:stretch>
+                      <a:fillRect/>
+                    </a:stretch>
+                  </pic:blipFill>
+                  <pic:spPr>
+                    <a:xfrm>
+                      <a:off x="0" y="0"/>
+                      <a:ext cx="5943600" cy="1310640"/>
+                    </a:xfrm>
+                    <a:prstGeom prst="rect">
+                      <a:avLst/>
+                    </a:prstGeom>
+                  </pic:spPr>
+                </pic:pic>
+              </a:graphicData>
+            </a:graphic>
+          </wp:inline>
+        </w:drawing>
+      </w:r>
+    </w:p>
+    <w:p>
+      <w:r>
         <w:tab/>
         <w:t>24</w:t>
       </w:r>
@@ -1108,6 +1346,46 @@
     </w:p>
     <w:p>
       <w:r>
+        <w:lastRenderedPageBreak/>
+        <w:drawing>
+          <wp:inline distT="0" distB="0" distL="0" distR="0" wp14:anchorId="181BB20B" wp14:editId="36B05E38">
+            <wp:extent cx="5943600" cy="2068195"/>
+            <wp:effectExtent l="0" t="0" r="0" b="8255"/>
+            <wp:docPr id="25" name="Picture 25"/>
+            <wp:cNvGraphicFramePr>
+              <a:graphicFrameLocks xmlns:a="http://schemas.openxmlformats.org/drawingml/2006/main" noChangeAspect="1"/>
+            </wp:cNvGraphicFramePr>
+            <a:graphic xmlns:a="http://schemas.openxmlformats.org/drawingml/2006/main">
+              <a:graphicData uri="http://schemas.openxmlformats.org/drawingml/2006/picture">
+                <pic:pic xmlns:pic="http://schemas.openxmlformats.org/drawingml/2006/picture">
+                  <pic:nvPicPr>
+                    <pic:cNvPr id="1" name=""/>
+                    <pic:cNvPicPr/>
+                  </pic:nvPicPr>
+                  <pic:blipFill>
+                    <a:blip r:embed="rId29"/>
+                    <a:stretch>
+                      <a:fillRect/>
+                    </a:stretch>
+                  </pic:blipFill>
+                  <pic:spPr>
+                    <a:xfrm>
+                      <a:off x="0" y="0"/>
+                      <a:ext cx="5943600" cy="2068195"/>
+                    </a:xfrm>
+                    <a:prstGeom prst="rect">
+                      <a:avLst/>
+                    </a:prstGeom>
+                  </pic:spPr>
+                </pic:pic>
+              </a:graphicData>
+            </a:graphic>
+          </wp:inline>
+        </w:drawing>
+      </w:r>
+    </w:p>
+    <w:p>
+      <w:r>
         <w:tab/>
         <w:t>25</w:t>
       </w:r>
@@ -1121,6 +1399,45 @@
     </w:p>
     <w:p>
       <w:r>
+        <w:drawing>
+          <wp:inline distT="0" distB="0" distL="0" distR="0" wp14:anchorId="33038D01" wp14:editId="2ACAC820">
+            <wp:extent cx="5943600" cy="708025"/>
+            <wp:effectExtent l="0" t="0" r="0" b="0"/>
+            <wp:docPr id="26" name="Picture 26"/>
+            <wp:cNvGraphicFramePr>
+              <a:graphicFrameLocks xmlns:a="http://schemas.openxmlformats.org/drawingml/2006/main" noChangeAspect="1"/>
+            </wp:cNvGraphicFramePr>
+            <a:graphic xmlns:a="http://schemas.openxmlformats.org/drawingml/2006/main">
+              <a:graphicData uri="http://schemas.openxmlformats.org/drawingml/2006/picture">
+                <pic:pic xmlns:pic="http://schemas.openxmlformats.org/drawingml/2006/picture">
+                  <pic:nvPicPr>
+                    <pic:cNvPr id="1" name=""/>
+                    <pic:cNvPicPr/>
+                  </pic:nvPicPr>
+                  <pic:blipFill>
+                    <a:blip r:embed="rId30"/>
+                    <a:stretch>
+                      <a:fillRect/>
+                    </a:stretch>
+                  </pic:blipFill>
+                  <pic:spPr>
+                    <a:xfrm>
+                      <a:off x="0" y="0"/>
+                      <a:ext cx="5943600" cy="708025"/>
+                    </a:xfrm>
+                    <a:prstGeom prst="rect">
+                      <a:avLst/>
+                    </a:prstGeom>
+                  </pic:spPr>
+                </pic:pic>
+              </a:graphicData>
+            </a:graphic>
+          </wp:inline>
+        </w:drawing>
+      </w:r>
+    </w:p>
+    <w:p>
+      <w:r>
         <w:tab/>
         <w:t>26</w:t>
       </w:r>
@@ -1134,6 +1451,45 @@
     </w:p>
     <w:p>
       <w:r>
+        <w:drawing>
+          <wp:inline distT="0" distB="0" distL="0" distR="0" wp14:anchorId="0409F7D3" wp14:editId="31D9F1CD">
+            <wp:extent cx="5943600" cy="781050"/>
+            <wp:effectExtent l="0" t="0" r="0" b="0"/>
+            <wp:docPr id="27" name="Picture 27"/>
+            <wp:cNvGraphicFramePr>
+              <a:graphicFrameLocks xmlns:a="http://schemas.openxmlformats.org/drawingml/2006/main" noChangeAspect="1"/>
+            </wp:cNvGraphicFramePr>
+            <a:graphic xmlns:a="http://schemas.openxmlformats.org/drawingml/2006/main">
+              <a:graphicData uri="http://schemas.openxmlformats.org/drawingml/2006/picture">
+                <pic:pic xmlns:pic="http://schemas.openxmlformats.org/drawingml/2006/picture">
+                  <pic:nvPicPr>
+                    <pic:cNvPr id="1" name=""/>
+                    <pic:cNvPicPr/>
+                  </pic:nvPicPr>
+                  <pic:blipFill>
+                    <a:blip r:embed="rId31"/>
+                    <a:stretch>
+                      <a:fillRect/>
+                    </a:stretch>
+                  </pic:blipFill>
+                  <pic:spPr>
+                    <a:xfrm>
+                      <a:off x="0" y="0"/>
+                      <a:ext cx="5943600" cy="781050"/>
+                    </a:xfrm>
+                    <a:prstGeom prst="rect">
+                      <a:avLst/>
+                    </a:prstGeom>
+                  </pic:spPr>
+                </pic:pic>
+              </a:graphicData>
+            </a:graphic>
+          </wp:inline>
+        </w:drawing>
+      </w:r>
+    </w:p>
+    <w:p>
+      <w:r>
         <w:tab/>
         <w:t>27</w:t>
       </w:r>
@@ -1147,6 +1503,45 @@
     </w:p>
     <w:p>
       <w:r>
+        <w:drawing>
+          <wp:inline distT="0" distB="0" distL="0" distR="0" wp14:anchorId="694A236F" wp14:editId="5D8F62F1">
+            <wp:extent cx="5943600" cy="2209800"/>
+            <wp:effectExtent l="0" t="0" r="0" b="0"/>
+            <wp:docPr id="28" name="Picture 28"/>
+            <wp:cNvGraphicFramePr>
+              <a:graphicFrameLocks xmlns:a="http://schemas.openxmlformats.org/drawingml/2006/main" noChangeAspect="1"/>
+            </wp:cNvGraphicFramePr>
+            <a:graphic xmlns:a="http://schemas.openxmlformats.org/drawingml/2006/main">
+              <a:graphicData uri="http://schemas.openxmlformats.org/drawingml/2006/picture">
+                <pic:pic xmlns:pic="http://schemas.openxmlformats.org/drawingml/2006/picture">
+                  <pic:nvPicPr>
+                    <pic:cNvPr id="1" name=""/>
+                    <pic:cNvPicPr/>
+                  </pic:nvPicPr>
+                  <pic:blipFill>
+                    <a:blip r:embed="rId32"/>
+                    <a:stretch>
+                      <a:fillRect/>
+                    </a:stretch>
+                  </pic:blipFill>
+                  <pic:spPr>
+                    <a:xfrm>
+                      <a:off x="0" y="0"/>
+                      <a:ext cx="5943600" cy="2209800"/>
+                    </a:xfrm>
+                    <a:prstGeom prst="rect">
+                      <a:avLst/>
+                    </a:prstGeom>
+                  </pic:spPr>
+                </pic:pic>
+              </a:graphicData>
+            </a:graphic>
+          </wp:inline>
+        </w:drawing>
+      </w:r>
+    </w:p>
+    <w:p>
+      <w:r>
         <w:tab/>
         <w:t>28</w:t>
       </w:r>
@@ -1160,6 +1555,46 @@
     </w:p>
     <w:p>
       <w:r>
+        <w:lastRenderedPageBreak/>
+        <w:drawing>
+          <wp:inline distT="0" distB="0" distL="0" distR="0" wp14:anchorId="1F8A54EF" wp14:editId="7854C76C">
+            <wp:extent cx="5943600" cy="3293745"/>
+            <wp:effectExtent l="0" t="0" r="0" b="1905"/>
+            <wp:docPr id="29" name="Picture 29"/>
+            <wp:cNvGraphicFramePr>
+              <a:graphicFrameLocks xmlns:a="http://schemas.openxmlformats.org/drawingml/2006/main" noChangeAspect="1"/>
+            </wp:cNvGraphicFramePr>
+            <a:graphic xmlns:a="http://schemas.openxmlformats.org/drawingml/2006/main">
+              <a:graphicData uri="http://schemas.openxmlformats.org/drawingml/2006/picture">
+                <pic:pic xmlns:pic="http://schemas.openxmlformats.org/drawingml/2006/picture">
+                  <pic:nvPicPr>
+                    <pic:cNvPr id="1" name=""/>
+                    <pic:cNvPicPr/>
+                  </pic:nvPicPr>
+                  <pic:blipFill>
+                    <a:blip r:embed="rId33"/>
+                    <a:stretch>
+                      <a:fillRect/>
+                    </a:stretch>
+                  </pic:blipFill>
+                  <pic:spPr>
+                    <a:xfrm>
+                      <a:off x="0" y="0"/>
+                      <a:ext cx="5943600" cy="3293745"/>
+                    </a:xfrm>
+                    <a:prstGeom prst="rect">
+                      <a:avLst/>
+                    </a:prstGeom>
+                  </pic:spPr>
+                </pic:pic>
+              </a:graphicData>
+            </a:graphic>
+          </wp:inline>
+        </w:drawing>
+      </w:r>
+    </w:p>
+    <w:p>
+      <w:r>
         <w:tab/>
         <w:t>29</w:t>
       </w:r>
@@ -1179,6 +1614,88 @@
         <w:tab/>
         <w:t>COPY index.html /usr/share/nginx/html/index.html</w:t>
       </w:r>
+    </w:p>
+    <w:p>
+      <w:r>
+        <w:drawing>
+          <wp:inline distT="0" distB="0" distL="0" distR="0" wp14:anchorId="3515C1C7" wp14:editId="4D01C082">
+            <wp:extent cx="5943600" cy="1567180"/>
+            <wp:effectExtent l="0" t="0" r="0" b="0"/>
+            <wp:docPr id="30" name="Picture 30"/>
+            <wp:cNvGraphicFramePr>
+              <a:graphicFrameLocks xmlns:a="http://schemas.openxmlformats.org/drawingml/2006/main" noChangeAspect="1"/>
+            </wp:cNvGraphicFramePr>
+            <a:graphic xmlns:a="http://schemas.openxmlformats.org/drawingml/2006/main">
+              <a:graphicData uri="http://schemas.openxmlformats.org/drawingml/2006/picture">
+                <pic:pic xmlns:pic="http://schemas.openxmlformats.org/drawingml/2006/picture">
+                  <pic:nvPicPr>
+                    <pic:cNvPr id="1" name=""/>
+                    <pic:cNvPicPr/>
+                  </pic:nvPicPr>
+                  <pic:blipFill>
+                    <a:blip r:embed="rId34"/>
+                    <a:stretch>
+                      <a:fillRect/>
+                    </a:stretch>
+                  </pic:blipFill>
+                  <pic:spPr>
+                    <a:xfrm>
+                      <a:off x="0" y="0"/>
+                      <a:ext cx="5943600" cy="1567180"/>
+                    </a:xfrm>
+                    <a:prstGeom prst="rect">
+                      <a:avLst/>
+                    </a:prstGeom>
+                  </pic:spPr>
+                </pic:pic>
+              </a:graphicData>
+            </a:graphic>
+          </wp:inline>
+        </w:drawing>
+      </w:r>
+    </w:p>
+    <w:p>
+      <w:r>
+        <w:lastRenderedPageBreak/>
+        <w:drawing>
+          <wp:inline distT="0" distB="0" distL="0" distR="0" wp14:anchorId="68DEC516" wp14:editId="47F3E9A2">
+            <wp:extent cx="5943600" cy="3298825"/>
+            <wp:effectExtent l="0" t="0" r="0" b="0"/>
+            <wp:docPr id="31" name="Picture 31"/>
+            <wp:cNvGraphicFramePr>
+              <a:graphicFrameLocks xmlns:a="http://schemas.openxmlformats.org/drawingml/2006/main" noChangeAspect="1"/>
+            </wp:cNvGraphicFramePr>
+            <a:graphic xmlns:a="http://schemas.openxmlformats.org/drawingml/2006/main">
+              <a:graphicData uri="http://schemas.openxmlformats.org/drawingml/2006/picture">
+                <pic:pic xmlns:pic="http://schemas.openxmlformats.org/drawingml/2006/picture">
+                  <pic:nvPicPr>
+                    <pic:cNvPr id="1" name=""/>
+                    <pic:cNvPicPr/>
+                  </pic:nvPicPr>
+                  <pic:blipFill>
+                    <a:blip r:embed="rId35"/>
+                    <a:stretch>
+                      <a:fillRect/>
+                    </a:stretch>
+                  </pic:blipFill>
+                  <pic:spPr>
+                    <a:xfrm>
+                      <a:off x="0" y="0"/>
+                      <a:ext cx="5943600" cy="3298825"/>
+                    </a:xfrm>
+                    <a:prstGeom prst="rect">
+                      <a:avLst/>
+                    </a:prstGeom>
+                  </pic:spPr>
+                </pic:pic>
+              </a:graphicData>
+            </a:graphic>
+          </wp:inline>
+        </w:drawing>
+      </w:r>
+    </w:p>
+    <w:p/>
+    <w:p>
       <w:r>
         <w:tab/>
       </w:r>
@@ -1198,6 +1715,45 @@
     </w:p>
     <w:p>
       <w:r>
+        <w:drawing>
+          <wp:inline distT="0" distB="0" distL="0" distR="0" wp14:anchorId="5621AE01" wp14:editId="781A7536">
+            <wp:extent cx="5943600" cy="2394585"/>
+            <wp:effectExtent l="0" t="0" r="0" b="5715"/>
+            <wp:docPr id="33" name="Picture 33"/>
+            <wp:cNvGraphicFramePr>
+              <a:graphicFrameLocks xmlns:a="http://schemas.openxmlformats.org/drawingml/2006/main" noChangeAspect="1"/>
+            </wp:cNvGraphicFramePr>
+            <a:graphic xmlns:a="http://schemas.openxmlformats.org/drawingml/2006/main">
+              <a:graphicData uri="http://schemas.openxmlformats.org/drawingml/2006/picture">
+                <pic:pic xmlns:pic="http://schemas.openxmlformats.org/drawingml/2006/picture">
+                  <pic:nvPicPr>
+                    <pic:cNvPr id="1" name=""/>
+                    <pic:cNvPicPr/>
+                  </pic:nvPicPr>
+                  <pic:blipFill>
+                    <a:blip r:embed="rId36"/>
+                    <a:stretch>
+                      <a:fillRect/>
+                    </a:stretch>
+                  </pic:blipFill>
+                  <pic:spPr>
+                    <a:xfrm>
+                      <a:off x="0" y="0"/>
+                      <a:ext cx="5943600" cy="2394585"/>
+                    </a:xfrm>
+                    <a:prstGeom prst="rect">
+                      <a:avLst/>
+                    </a:prstGeom>
+                  </pic:spPr>
+                </pic:pic>
+              </a:graphicData>
+            </a:graphic>
+          </wp:inline>
+        </w:drawing>
+      </w:r>
+    </w:p>
+    <w:p>
+      <w:r>
         <w:tab/>
         <w:t>31</w:t>
       </w:r>
@@ -1207,6 +1763,85 @@
       </w:r>
       <w:r>
         <w:tab/>
+      </w:r>
+    </w:p>
+    <w:p>
+      <w:r>
+        <w:drawing>
+          <wp:inline distT="0" distB="0" distL="0" distR="0" wp14:anchorId="77AB2441" wp14:editId="50D481C1">
+            <wp:extent cx="5943600" cy="663575"/>
+            <wp:effectExtent l="0" t="0" r="0" b="3175"/>
+            <wp:docPr id="34" name="Picture 34"/>
+            <wp:cNvGraphicFramePr>
+              <a:graphicFrameLocks xmlns:a="http://schemas.openxmlformats.org/drawingml/2006/main" noChangeAspect="1"/>
+            </wp:cNvGraphicFramePr>
+            <a:graphic xmlns:a="http://schemas.openxmlformats.org/drawingml/2006/main">
+              <a:graphicData uri="http://schemas.openxmlformats.org/drawingml/2006/picture">
+                <pic:pic xmlns:pic="http://schemas.openxmlformats.org/drawingml/2006/picture">
+                  <pic:nvPicPr>
+                    <pic:cNvPr id="1" name=""/>
+                    <pic:cNvPicPr/>
+                  </pic:nvPicPr>
+                  <pic:blipFill>
+                    <a:blip r:embed="rId37"/>
+                    <a:stretch>
+                      <a:fillRect/>
+                    </a:stretch>
+                  </pic:blipFill>
+                  <pic:spPr>
+                    <a:xfrm>
+                      <a:off x="0" y="0"/>
+                      <a:ext cx="5943600" cy="663575"/>
+                    </a:xfrm>
+                    <a:prstGeom prst="rect">
+                      <a:avLst/>
+                    </a:prstGeom>
+                  </pic:spPr>
+                </pic:pic>
+              </a:graphicData>
+            </a:graphic>
+          </wp:inline>
+        </w:drawing>
+      </w:r>
+    </w:p>
+    <w:p>
+      <w:r>
+        <w:lastRenderedPageBreak/>
+        <w:drawing>
+          <wp:inline distT="0" distB="0" distL="0" distR="0" wp14:anchorId="4E0C0F82" wp14:editId="23D16585">
+            <wp:extent cx="5943600" cy="2395220"/>
+            <wp:effectExtent l="0" t="0" r="0" b="5080"/>
+            <wp:docPr id="35" name="Picture 35"/>
+            <wp:cNvGraphicFramePr>
+              <a:graphicFrameLocks xmlns:a="http://schemas.openxmlformats.org/drawingml/2006/main" noChangeAspect="1"/>
+            </wp:cNvGraphicFramePr>
+            <a:graphic xmlns:a="http://schemas.openxmlformats.org/drawingml/2006/main">
+              <a:graphicData uri="http://schemas.openxmlformats.org/drawingml/2006/picture">
+                <pic:pic xmlns:pic="http://schemas.openxmlformats.org/drawingml/2006/picture">
+                  <pic:nvPicPr>
+                    <pic:cNvPr id="1" name=""/>
+                    <pic:cNvPicPr/>
+                  </pic:nvPicPr>
+                  <pic:blipFill>
+                    <a:blip r:embed="rId38"/>
+                    <a:stretch>
+                      <a:fillRect/>
+                    </a:stretch>
+                  </pic:blipFill>
+                  <pic:spPr>
+                    <a:xfrm>
+                      <a:off x="0" y="0"/>
+                      <a:ext cx="5943600" cy="2395220"/>
+                    </a:xfrm>
+                    <a:prstGeom prst="rect">
+                      <a:avLst/>
+                    </a:prstGeom>
+                  </pic:spPr>
+                </pic:pic>
+              </a:graphicData>
+            </a:graphic>
+          </wp:inline>
+        </w:drawing>
       </w:r>
     </w:p>
     <w:sectPr>

</xml_diff>